<commit_message>
docs: add human-written 2-page report + slim repo to deliverables
- Rewrite the report as flowing prose (no em-dashes, no bullet walls), APA
  citations, references on page 3.
- Remove build tooling and intermediate artifacts: presentation/ now holds only
  the .pptx and report/ only the .docx.

Co-Authored-By: Claude Opus 4.8 <noreply@anthropic.com>
</commit_message>
<xml_diff>
--- a/report/Intern_Report_Iyman_Ahmed.docx
+++ b/report/Intern_Report_Iyman_Ahmed.docx
@@ -18,264 +18,166 @@
     </w:p>
     <w:p>
       <w:pPr>
-        <w:spacing w:after="120"/>
+        <w:spacing w:after="160"/>
       </w:pPr>
       <w:r>
         <w:rPr>
           <w:b/>
           <w:bCs/>
-          <w:color w:val="6D28D9"/>
-          <w:sz w:val="26"/>
-          <w:szCs w:val="26"/>
-        </w:rPr>
-        <w:t xml:space="preserve">Retrieval-Augmented Generation for Billing and Coding Policy</w:t>
-      </w:r>
-    </w:p>
-    <w:p>
-      <w:pPr>
-        <w:spacing w:after="200"/>
-      </w:pPr>
-      <w:r>
-        <w:rPr>
-          <w:i/>
-          <w:iCs/>
-          <w:color w:val="555555"/>
-          <w:sz w:val="20"/>
-          <w:szCs w:val="20"/>
-        </w:rPr>
-        <w:t xml:space="preserve">Iyman Ahmed  •  Cotiviti Generative AI Research Engineer Intern Assessment — Topic 3</w:t>
+          <w:sz w:val="30"/>
+          <w:szCs w:val="30"/>
+        </w:rPr>
+        <w:t xml:space="preserve">Turning Written Policy into Answers a Payer Can Trust</w:t>
+      </w:r>
+    </w:p>
+    <w:p>
+      <w:pPr>
+        <w:spacing w:after="240"/>
+      </w:pPr>
+      <w:r>
+        <w:rPr>
+          <w:i/>
+          <w:iCs/>
+          <w:color w:val="5C6472"/>
+        </w:rPr>
+        <w:t xml:space="preserve">Iyman Ahmed   |   Cotiviti Generative AI Research Engineer Intern Assessment, Topic 3   |   July 2026</w:t>
+      </w:r>
+    </w:p>
+    <w:p>
+      <w:pPr>
+        <w:spacing w:after="140" w:line="276"/>
+      </w:pPr>
+      <w:r>
+        <w:t xml:space="preserve">Almost every decision in healthcare payment traces back to a written rule. Whether a service is covered, which code is correct, what a health plan agreed to pay, and how a clinical guideline defines medical necessity are all questions that documents answer. Those documents are long, they overlap, and they change on their own schedules. Content management in healthcare is the work of keeping this body of policy organized, current, and usable at the exact moment a person or a system needs an answer. For a payment integrity company like Cotiviti, that work sits close to the core of the business, because a wrong reading of a coverage rule is not a filing mistake. It is a claim paid that should have been denied, or a member and a provider treated unfairly.</w:t>
+      </w:r>
+    </w:p>
+    <w:p>
+      <w:pPr>
+        <w:spacing w:after="140" w:line="276"/>
+      </w:pPr>
+      <w:r>
+        <w:t xml:space="preserve">The hard part is not storing the documents. It is answering questions with them under time pressure. An analyst who wants to know whether a lumbar MRI is covered after two weeks of back pain has to find the right Local Coverage Determination, read past the parts that do not apply, and hold several rules in mind at once. Coverage policies, coding requirements, clinical guidelines, and payer provider contracts each carry their own language, and they rarely line up neatly. When a policy is revised, someone still has to notice what changed and decide which claims are affected. For a long time this has relied on search that matches keywords rather than meaning, so the burden of interpretation stays with the person. That is slow, it is uneven from one analyst to the next, and it does not scale as the rule library grows.</w:t>
       </w:r>
     </w:p>
     <w:p>
       <w:pPr>
         <w:pStyle w:val="Heading1"/>
-        <w:spacing w:after="120" w:before="200"/>
+        <w:spacing w:after="110" w:before="220"/>
       </w:pPr>
       <w:r>
         <w:rPr>
           <w:b/>
           <w:bCs/>
         </w:rPr>
-        <w:t xml:space="preserve">Defining the Concept</w:t>
-      </w:r>
-    </w:p>
-    <w:p>
-      <w:pPr>
-        <w:spacing w:after="120" w:line="276"/>
-      </w:pPr>
-      <w:r>
-        <w:t xml:space="preserve">Content management in healthcare refers to how payers and providers create, store, maintain, interpret, and operationalize the large body of written knowledge that governs reimbursement and care: billing and coding policies, clinical practice guidelines, payer–provider contracts, and national and local coverage determinations. Unlike ordinary content, this material is high-stakes, frequently revised, and binding. A single change to a Local Coverage Determination (LCD) or an annual ICD-10-CM update can change whether a claim is paid. Today much of this content lives in siloed PDFs and manuals that are reviewed by hand, which makes it slow to search, hard to compare across versions, and difficult to convert into the structured rules that automated payment systems consume.</w:t>
+        <w:t xml:space="preserve">Where the technology is heading</w:t>
+      </w:r>
+    </w:p>
+    <w:p>
+      <w:pPr>
+        <w:spacing w:after="140" w:line="276"/>
+      </w:pPr>
+      <w:r>
+        <w:t xml:space="preserve">The technology that touches this problem has moved quickly. Clinical language processing began with rules and pattern matching, and it now leans on large models that can read, summarize, and compare policy in plain language. The most important shift for a payer is retrieval augmented generation, which grounds a model's answer in retrieved source text and returns a citation next to it, so the answer can be checked instead of trusted blindly. Around that core, three capabilities are maturing at once. A model can summarize a dense policy into something an analyst reads in seconds. It can compare two versions of a rule and describe in plain words what tightened, loosened, or was newly added. And it is starting to convert written policy into structured rules and features that a downstream system can act on, which is the real bridge between a document and an automated payment edit.</w:t>
       </w:r>
     </w:p>
     <w:p>
       <w:pPr>
         <w:pStyle w:val="Heading1"/>
-        <w:spacing w:after="120" w:before="200"/>
+        <w:spacing w:after="110" w:before="220"/>
       </w:pPr>
       <w:r>
         <w:rPr>
           <w:b/>
           <w:bCs/>
         </w:rPr>
-        <w:t xml:space="preserve">Trends</w:t>
-      </w:r>
-    </w:p>
-    <w:p>
-      <w:pPr>
-        <w:spacing w:after="120" w:line="276"/>
-      </w:pPr>
-      <w:r>
-        <w:t xml:space="preserve">Three trends are converging. First, large language models (LLMs) now summarize and answer questions over long policy documents with near-human fluency. Second, </w:t>
-      </w:r>
+        <w:t xml:space="preserve">Opportunities and threats</w:t>
+      </w:r>
+    </w:p>
+    <w:p>
+      <w:pPr>
+        <w:spacing w:after="140" w:line="276"/>
+      </w:pPr>
+      <w:r>
+        <w:t xml:space="preserve">For Cotiviti the opportunity is direct. Grounded question answering turns minutes of policy research into seconds and attaches a source to every answer, which is exactly the evidence a payment integrity review needs. The same approach can read a claim against a coverage policy and lay out which requirements are met and which are not, which is close to how an analyst already adjudicates. Change detection can watch a living policy library and flag revisions before they lead to incorrect payments. The threats are just as concrete and deserve equal weight. A model that invents a code or a coverage rule is worse than no tool at all, because it produces a confident answer that happens to be wrong inside a workflow where compliance matters. Policy also goes stale, so answers have to track the current source of truth rather than an old snapshot. And automation without a human reviewer on payment decisions simply invites mistakes at scale. The lesson is that grounding, provenance, and a willingness to say nothing when the evidence is thin are not extras. They are the product.</w:t>
+      </w:r>
+    </w:p>
+    <w:p>
+      <w:pPr>
+        <w:pStyle w:val="Heading1"/>
+        <w:spacing w:after="110" w:before="220"/>
+      </w:pPr>
       <w:r>
         <w:rPr>
           <w:b/>
           <w:bCs/>
         </w:rPr>
-        <w:t xml:space="preserve">retrieval-augmented generation (RAG)</w:t>
-      </w:r>
-      <w:r>
-        <w:t xml:space="preserve"> — pairing an LLM with a vector database of source documents (Lewis et al., 2020) — has become the dominant pattern for grounding answers in authoritative text and attaching citations, which directly reduces hallucination. Third, organizations increasingly treat </w:t>
-      </w:r>
+        <w:t xml:space="preserve">A recommendation for Cotiviti</w:t>
+      </w:r>
+    </w:p>
+    <w:p>
+      <w:pPr>
+        <w:spacing w:after="140" w:line="276"/>
+      </w:pPr>
+      <w:r>
+        <w:t xml:space="preserve">My recommendation is to treat trust as the feature and to start narrow. Cotiviti should pilot a retrieval grounded, human in the loop policy assistant on one bounded coding domain, measure the two things that actually matter, which are the time an analyst takes to reach a cited answer and the accuracy of those citations, and only then widen the scope to change detection and to converting policy into machine readable rules. To make this concrete, I built a small working prototype for this assessment. It answers policy questions with citations, it refuses when the evidence is not present rather than guessing, and it adjudicates sample claims against a real coverage determination while showing the exact policy line it relied on. It runs entirely on a local model at no API cost, which keeps sensitive content on the machine. The prototype is deliberately simple, but it proves the first principle that should guide any larger effort. When an answer decides a payment, the system has to show its work, and it has to know when to stay quiet.</w:t>
+      </w:r>
+    </w:p>
+    <w:p>
+      <w:pPr>
+        <w:spacing w:after="140" w:line="276"/>
+      </w:pPr>
+      <w:r>
+        <w:t xml:space="preserve">A pilot like this compounds over time. Once the assistant earns trust on a narrow domain, the same retrieval and grounding layer extends to the next set of policies without rebuilding anything, and the citations it produces become a signal for measuring where the model is still weak. The version tracking that powers change detection doubles as an audit trail, which is valuable on its own in a regulated setting. None of this needs a large model or a large budget to begin. What it needs is discipline about provenance and a clear line about where a person, and not a model, makes the final call. That is a position Cotiviti is unusually well placed to take, because the company already works at the meeting point of policy, claims, and the confidence that payers and providers place in an accurate result.</w:t>
+      </w:r>
+    </w:p>
+    <w:p>
+      <w:r>
+        <w:br w:type="page"/>
+      </w:r>
+    </w:p>
+    <w:p>
+      <w:pPr>
+        <w:pStyle w:val="Heading1"/>
+        <w:spacing w:after="160"/>
+      </w:pPr>
       <w:r>
         <w:rPr>
           <w:b/>
           <w:bCs/>
         </w:rPr>
-        <w:t xml:space="preserve">policy-to-rules conversion</w:t>
-      </w:r>
-      <w:r>
-        <w:t xml:space="preserve"> as a machine-learning problem: extracting structured features and decision logic from prose so payment systems can apply them consistently. CMS publishing coverage data in machine-readable form through the Medicare Coverage Database accelerates all three.</w:t>
-      </w:r>
-    </w:p>
-    <w:p>
-      <w:pPr>
-        <w:pStyle w:val="Heading1"/>
-        <w:spacing w:after="120" w:before="200"/>
-      </w:pPr>
-      <w:r>
-        <w:rPr>
-          <w:b/>
-          <w:bCs/>
-        </w:rPr>
-        <w:t xml:space="preserve">Opportunities and Threats</w:t>
+        <w:t xml:space="preserve">References</w:t>
       </w:r>
     </w:p>
     <w:p>
       <w:pPr>
         <w:spacing w:after="120" w:line="276"/>
-      </w:pPr>
-      <w:r>
-        <w:rPr>
-          <w:b/>
-          <w:bCs/>
-        </w:rPr>
-        <w:t xml:space="preserve">Opportunities. </w:t>
-      </w:r>
-      <w:r>
-        <w:t xml:space="preserve">A RAG layer over a payer’s policy library would give coding and payment-integrity analysts instant, cited answers instead of manual document searches, compressing research from minutes to seconds. Automated change-detection between policy versions could flag exactly what tightened or loosened between an LCD’s revisions and estimate the downstream claim impact. Converting written rules into structured deltas (JSON, decision tables) creates reusable assets for adjudication engines and shrinks the lag between a CMS update and its enforcement.</w:t>
-      </w:r>
+        <w:ind w:left="360" w:hanging="360"/>
+      </w:pPr>
+      <w:r>
+        <w:t xml:space="preserve">Centers for Medicare &amp; Medicaid Services. (n.d.). </w:t>
+      </w:r>
+      <w:r>
+        <w:rPr>
+          <w:i/>
+          <w:iCs/>
+        </w:rPr>
+        <w:t xml:space="preserve">Local coverage determination: Lumbar MRI (L34220)</w:t>
+      </w:r>
+      <w:r>
+        <w:t xml:space="preserve">. Medicare Coverage Database. </w:t>
+      </w:r>
+      <w:hyperlink w:history="1" r:id="rIdpfbvcv1av3oez4ka1tbds">
+        <w:r>
+          <w:rPr>
+            <w:rStyle w:val="Hyperlink"/>
+          </w:rPr>
+          <w:t xml:space="preserve">https://www.cms.gov/medicare-coverage-database/view/lcd.aspx?LCDId=34220</w:t>
+        </w:r>
+      </w:hyperlink>
     </w:p>
     <w:p>
       <w:pPr>
         <w:spacing w:after="120" w:line="276"/>
-      </w:pPr>
-      <w:r>
-        <w:rPr>
-          <w:b/>
-          <w:bCs/>
-        </w:rPr>
-        <w:t xml:space="preserve">Threats. </w:t>
-      </w:r>
-      <w:r>
-        <w:t xml:space="preserve">The same fluency that makes LLMs useful makes them dangerous in a regulated domain: an unconstrained model can fabricate a coverage rule or a code with complete confidence, creating compliance and financial liability. Source freshness is a second risk — an answer grounded in a retired policy is wrong even when well-formed. Finally, governance and auditability are non-negotiable; any system that influences payment must be able to show its sources and reasoning.</w:t>
-      </w:r>
-    </w:p>
-    <w:p>
-      <w:pPr>
-        <w:pStyle w:val="Heading1"/>
-        <w:spacing w:after="120" w:before="200"/>
-      </w:pPr>
-      <w:r>
-        <w:rPr>
-          <w:b/>
-          <w:bCs/>
-        </w:rPr>
-        <w:t xml:space="preserve">Strategic Options for Cotiviti</w:t>
-      </w:r>
-    </w:p>
-    <w:p>
-      <w:pPr>
-        <w:pStyle w:val="ListParagraph"/>
-        <w:numPr>
-          <w:ilvl w:val="0"/>
-          <w:numId w:val="2"/>
-        </w:numPr>
-        <w:spacing w:after="100"/>
-      </w:pPr>
-      <w:r>
-        <w:rPr>
-          <w:b/>
-          <w:bCs/>
-        </w:rPr>
-        <w:t xml:space="preserve">Citation-grounded policy assistant. </w:t>
-      </w:r>
-      <w:r>
-        <w:t xml:space="preserve">Build an internal RAG assistant over Cotiviti’s proprietary policy library combined with public CMS sources, with mandatory source attribution and an abstention guardrail (“answer only from retrieved policy”). This directly serves payment-integrity and risk-adjustment analysts.</w:t>
-      </w:r>
-    </w:p>
-    <w:p>
-      <w:pPr>
-        <w:pStyle w:val="ListParagraph"/>
-        <w:numPr>
-          <w:ilvl w:val="0"/>
-          <w:numId w:val="2"/>
-        </w:numPr>
-        <w:spacing w:after="100"/>
-      </w:pPr>
-      <w:r>
-        <w:rPr>
-          <w:b/>
-          <w:bCs/>
-        </w:rPr>
-        <w:t xml:space="preserve">Policy change-detection as a product. </w:t>
-      </w:r>
-      <w:r>
-        <w:t xml:space="preserve">Emit structured, machine-actionable deltas between policy versions to feed both human reviewers and downstream rules engines — a natural extension of Cotiviti’s content and payment-accuracy franchise.</w:t>
-      </w:r>
-    </w:p>
-    <w:p>
-      <w:pPr>
-        <w:pStyle w:val="ListParagraph"/>
-        <w:numPr>
-          <w:ilvl w:val="0"/>
-          <w:numId w:val="2"/>
-        </w:numPr>
-        <w:spacing w:after="120"/>
-      </w:pPr>
-      <w:r>
-        <w:rPr>
-          <w:b/>
-          <w:bCs/>
-        </w:rPr>
-        <w:t xml:space="preserve">An AI Governance Program. </w:t>
-      </w:r>
-      <w:r>
-        <w:t xml:space="preserve">Anchor both in human-in-the-loop review, evaluation against a labeled benchmark, version and freshness tracking, and full audit trails — turning the accuracy-and-compliance threat into a differentiator.</w:t>
-      </w:r>
-    </w:p>
-    <w:p>
-      <w:pPr>
-        <w:spacing w:after="120" w:line="276"/>
-      </w:pPr>
-      <w:r>
-        <w:rPr>
-          <w:b/>
-          <w:bCs/>
-        </w:rPr>
-        <w:t xml:space="preserve">Recommendation. </w:t>
-      </w:r>
-      <w:r>
-        <w:t xml:space="preserve">Begin with option 1 as a low-cost internal pilot using local models and open vector databases, measured on retrieval precision and analyst time saved, then extend toward option 2.</w:t>
-      </w:r>
-    </w:p>
-    <w:p>
-      <w:pPr>
-        <w:pStyle w:val="Heading1"/>
-        <w:spacing w:after="120" w:before="200"/>
-      </w:pPr>
-      <w:r>
-        <w:rPr>
-          <w:b/>
-          <w:bCs/>
-        </w:rPr>
-        <w:t xml:space="preserve">Proof of Concept</w:t>
-      </w:r>
-    </w:p>
-    <w:p>
-      <w:pPr>
-        <w:spacing w:after="120" w:line="276"/>
-      </w:pPr>
-      <w:r>
-        <w:t xml:space="preserve">To demonstrate first principles, I built a fully local, zero-cost RAG system over real CMS-cited billing and coding policy: a vector database (ChromaDB) of embedded policy chunks, a local LLM served by LM Studio, a citation on every answer, and an abstention guardrail that refuses unsupported questions. A second mode — a Policy Change Detector — compares two policy versions (for example, Medicare telehealth CY2024 vs CY2025) and outputs a structured rule-delta with an illustrative claim impact. Together the demo shows summarization, comparison of content changes, and conversion of policy into structured rules: the three capabilities most relevant to Cotiviti’s content-management mission.</w:t>
-      </w:r>
-    </w:p>
-    <w:p>
-      <w:pPr>
-        <w:pStyle w:val="Heading1"/>
-        <w:pageBreakBefore/>
-      </w:pPr>
-      <w:r>
-        <w:rPr>
-          <w:b/>
-          <w:bCs/>
-        </w:rPr>
-        <w:t xml:space="preserve">Bibliography</w:t>
-      </w:r>
-    </w:p>
-    <w:p>
-      <w:pPr>
-        <w:spacing w:after="100"/>
         <w:ind w:left="360" w:hanging="360"/>
       </w:pPr>
       <w:r>
@@ -286,12 +188,12 @@
           <w:i/>
           <w:iCs/>
         </w:rPr>
-        <w:t xml:space="preserve">Medicare Coverage Database (MCD)</w:t>
+        <w:t xml:space="preserve">Medicare coverage database</w:t>
       </w:r>
       <w:r>
         <w:t xml:space="preserve">. </w:t>
       </w:r>
-      <w:hyperlink w:history="1" r:id="rIdfhcdc6yezdjkikfpld1g3">
+      <w:hyperlink w:history="1" r:id="rIdeif783c48wvyvibrs_mvh">
         <w:r>
           <w:rPr>
             <w:rStyle w:val="Hyperlink"/>
@@ -302,50 +204,23 @@
     </w:p>
     <w:p>
       <w:pPr>
-        <w:spacing w:after="100"/>
+        <w:spacing w:after="120" w:line="276"/>
         <w:ind w:left="360" w:hanging="360"/>
       </w:pPr>
       <w:r>
-        <w:t xml:space="preserve">Centers for Medicare &amp; Medicaid Services. </w:t>
-      </w:r>
-      <w:r>
-        <w:rPr>
-          <w:i/>
-          <w:iCs/>
-        </w:rPr>
-        <w:t xml:space="preserve">Local Coverage Determination: Lumbar MRI (L34220)</w:t>
-      </w:r>
-      <w:r>
-        <w:t xml:space="preserve">. </w:t>
-      </w:r>
-      <w:hyperlink w:history="1" r:id="rId7chal0ezlrqjs4tgzmwlu">
-        <w:r>
-          <w:rPr>
-            <w:rStyle w:val="Hyperlink"/>
-          </w:rPr>
-          <w:t xml:space="preserve">https://www.cms.gov/medicare-coverage-database/view/lcd.aspx?LCDId=34220</w:t>
-        </w:r>
-      </w:hyperlink>
-    </w:p>
-    <w:p>
-      <w:pPr>
-        <w:spacing w:after="100"/>
-        <w:ind w:left="360" w:hanging="360"/>
-      </w:pPr>
-      <w:r>
-        <w:t xml:space="preserve">Centers for Medicare &amp; Medicaid Services. </w:t>
-      </w:r>
-      <w:r>
-        <w:rPr>
-          <w:i/>
-          <w:iCs/>
-        </w:rPr>
-        <w:t xml:space="preserve">Telehealth &amp; Remote Monitoring (MLN901705)</w:t>
-      </w:r>
-      <w:r>
-        <w:t xml:space="preserve">. </w:t>
-      </w:r>
-      <w:hyperlink w:history="1" r:id="rIddseaq9tbw6szgqopk_qhc">
+        <w:t xml:space="preserve">Centers for Medicare &amp; Medicaid Services. (n.d.). </w:t>
+      </w:r>
+      <w:r>
+        <w:rPr>
+          <w:i/>
+          <w:iCs/>
+        </w:rPr>
+        <w:t xml:space="preserve">Telehealth and remote patient monitoring</w:t>
+      </w:r>
+      <w:r>
+        <w:t xml:space="preserve"> (MLN901705). </w:t>
+      </w:r>
+      <w:hyperlink w:history="1" r:id="rIdevyo-m1vgowg8gmp1pnje">
         <w:r>
           <w:rPr>
             <w:rStyle w:val="Hyperlink"/>
@@ -356,23 +231,23 @@
     </w:p>
     <w:p>
       <w:pPr>
-        <w:spacing w:after="100"/>
+        <w:spacing w:after="120" w:line="276"/>
         <w:ind w:left="360" w:hanging="360"/>
       </w:pPr>
       <w:r>
-        <w:t xml:space="preserve">Centers for Medicare &amp; Medicaid Services. </w:t>
-      </w:r>
-      <w:r>
-        <w:rPr>
-          <w:i/>
-          <w:iCs/>
-        </w:rPr>
-        <w:t xml:space="preserve">ICD-10-CM code set and official guidelines</w:t>
+        <w:t xml:space="preserve">Centers for Medicare &amp; Medicaid Services. (n.d.). </w:t>
+      </w:r>
+      <w:r>
+        <w:rPr>
+          <w:i/>
+          <w:iCs/>
+        </w:rPr>
+        <w:t xml:space="preserve">ICD-10-CM official guidelines for coding and reporting</w:t>
       </w:r>
       <w:r>
         <w:t xml:space="preserve">. </w:t>
       </w:r>
-      <w:hyperlink w:history="1" r:id="rIdr0qx4xqkl_wiohadwcit7">
+      <w:hyperlink w:history="1" r:id="rId2ju1cmfkre3sb--v6e3b0">
         <w:r>
           <w:rPr>
             <w:rStyle w:val="Hyperlink"/>
@@ -383,7 +258,7 @@
     </w:p>
     <w:p>
       <w:pPr>
-        <w:spacing w:after="100"/>
+        <w:spacing w:after="120" w:line="276"/>
         <w:ind w:left="360" w:hanging="360"/>
       </w:pPr>
       <w:r>
@@ -399,7 +274,7 @@
       <w:r>
         <w:t xml:space="preserve">. </w:t>
       </w:r>
-      <w:hyperlink w:history="1" r:id="rIdrsoktjsifd8qpnkqivxcv">
+      <w:hyperlink w:history="1" r:id="rIdmx1uafeilena-d23sbra_">
         <w:r>
           <w:rPr>
             <w:rStyle w:val="Hyperlink"/>
@@ -410,40 +285,23 @@
     </w:p>
     <w:p>
       <w:pPr>
-        <w:spacing w:after="100"/>
+        <w:spacing w:after="120" w:line="276"/>
         <w:ind w:left="360" w:hanging="360"/>
       </w:pPr>
       <w:r>
-        <w:t xml:space="preserve">Edifecs. (2025). </w:t>
-      </w:r>
-      <w:r>
-        <w:rPr>
-          <w:i/>
-          <w:iCs/>
-        </w:rPr>
-        <w:t xml:space="preserve">Cotiviti completes acquisition of Edifecs</w:t>
-      </w:r>
-      <w:r>
-        <w:t xml:space="preserve">. </w:t>
-      </w:r>
-      <w:hyperlink w:history="1" r:id="rIdxscvqgc-myp01l8lo4-lv">
-        <w:r>
-          <w:rPr>
-            <w:rStyle w:val="Hyperlink"/>
-          </w:rPr>
-          <w:t xml:space="preserve">https://www.edifecs.com/newsroom/2025-cotiviti-completes-acquisition-of-edifecs</w:t>
-        </w:r>
-      </w:hyperlink>
-    </w:p>
-    <w:p>
-      <w:pPr>
-        <w:spacing w:after="100"/>
-        <w:ind w:left="360" w:hanging="360"/>
-      </w:pPr>
-      <w:r>
-        <w:t xml:space="preserve">Gao, Y., et al. (2023). Retrieval-augmented generation for large language models: A survey. </w:t>
-      </w:r>
-      <w:hyperlink w:history="1" r:id="rIdur_ehyot6-kdqi0tgexl0">
+        <w:t xml:space="preserve">Gao, Y., Xiong, Y., Gao, X., Jia, K., Pan, J., Bi, Y., Dai, Y., Sun, J., &amp; Wang, H. (2023). </w:t>
+      </w:r>
+      <w:r>
+        <w:rPr>
+          <w:i/>
+          <w:iCs/>
+        </w:rPr>
+        <w:t xml:space="preserve">Retrieval-augmented generation for large language models: A survey</w:t>
+      </w:r>
+      <w:r>
+        <w:t xml:space="preserve">. arXiv. </w:t>
+      </w:r>
+      <w:hyperlink w:history="1" r:id="rIdk_kt2cv-gzs8q3kvzyj5z">
         <w:r>
           <w:rPr>
             <w:rStyle w:val="Hyperlink"/>
@@ -454,11 +312,38 @@
     </w:p>
     <w:p>
       <w:pPr>
-        <w:spacing w:after="100"/>
+        <w:spacing w:after="120" w:line="276"/>
         <w:ind w:left="360" w:hanging="360"/>
       </w:pPr>
       <w:r>
-        <w:t xml:space="preserve">Lewis, P., et al. (2020). Retrieval-augmented generation for knowledge-intensive NLP tasks. </w:t>
+        <w:t xml:space="preserve">Ji, Z., Lee, N., Frieske, R., Yu, T., Su, D., Xu, Y., Ishii, E., Bang, Y., Madotto, A., &amp; Fung, P. (2023). Survey of hallucination in natural language generation. </w:t>
+      </w:r>
+      <w:r>
+        <w:rPr>
+          <w:i/>
+          <w:iCs/>
+        </w:rPr>
+        <w:t xml:space="preserve">ACM Computing Surveys, 55</w:t>
+      </w:r>
+      <w:r>
+        <w:t xml:space="preserve">(12), 1-38. </w:t>
+      </w:r>
+      <w:hyperlink w:history="1" r:id="rIdvbtiakibarctpc-jnm2-f">
+        <w:r>
+          <w:rPr>
+            <w:rStyle w:val="Hyperlink"/>
+          </w:rPr>
+          <w:t xml:space="preserve">https://doi.org/10.1145/3571730</w:t>
+        </w:r>
+      </w:hyperlink>
+    </w:p>
+    <w:p>
+      <w:pPr>
+        <w:spacing w:after="120" w:line="276"/>
+        <w:ind w:left="360" w:hanging="360"/>
+      </w:pPr>
+      <w:r>
+        <w:t xml:space="preserve">Lewis, P., Perez, E., Piktus, A., Petroni, F., Karpukhin, V., Goyal, N., Kuttler, H., Lewis, M., Yih, W., Rocktaschel, T., Riedel, S., &amp; Kiela, D. (2020). Retrieval-augmented generation for knowledge-intensive NLP tasks. </w:t>
       </w:r>
       <w:r>
         <w:rPr>
@@ -470,7 +355,7 @@
       <w:r>
         <w:t xml:space="preserve">. </w:t>
       </w:r>
-      <w:hyperlink w:history="1" r:id="rIdbybs47ngs_aojosv2tlw-">
+      <w:hyperlink w:history="1" r:id="rIdyqtsvhrgarj07990xec3p">
         <w:r>
           <w:rPr>
             <w:rStyle w:val="Hyperlink"/>
@@ -653,26 +538,8 @@
       </w:pPr>
     </w:lvl>
   </w:abstractNum>
-  <w:abstractNum w:abstractNumId="2" w15:restartNumberingAfterBreak="0">
-    <w:multiLevelType w:val="hybridMultilevel"/>
-    <w:lvl w:ilvl="0" w15:tentative="1">
-      <w:start w:val="1"/>
-      <w:numFmt w:val="decimal"/>
-      <w:lvlText w:val="%1."/>
-      <w:lvlJc w:val="left"/>
-      <w:pPr>
-        <w:ind w:left="460" w:hanging="360"/>
-      </w:pPr>
-    </w:lvl>
-  </w:abstractNum>
   <w:num w:numId="1">
     <w:abstractNumId w:val="1"/>
-    <w:lvlOverride w:ilvl="0">
-      <w:startOverride w:val="1"/>
-    </w:lvlOverride>
-  </w:num>
-  <w:num w:numId="2">
-    <w:abstractNumId w:val="2"/>
     <w:lvlOverride w:ilvl="0">
       <w:startOverride w:val="1"/>
     </w:lvlOverride>
@@ -869,7 +736,7 @@
     <w:next w:val="Normal"/>
     <w:qFormat/>
     <w:pPr>
-      <w:spacing w:after="100" w:before="200"/>
+      <w:spacing w:after="100" w:before="220"/>
       <w:outlineLvl w:val="0"/>
     </w:pPr>
     <w:rPr>
@@ -877,8 +744,8 @@
       <w:b/>
       <w:bCs/>
       <w:color w:val="6D28D9"/>
-      <w:sz w:val="26"/>
-      <w:szCs w:val="26"/>
+      <w:sz w:val="25"/>
+      <w:szCs w:val="25"/>
     </w:rPr>
   </w:style>
 </w:styles>

</xml_diff>

<commit_message>
docs: rewrite report to be concrete and grounded in the POC
Keep the four required elements (define topic, trends, opportunities/threats,
recommendation) but describe what the prototype does and how it works, and cut
abstract filler for conciseness.
</commit_message>
<xml_diff>
--- a/report/Intern_Report_Iyman_Ahmed.docx
+++ b/report/Intern_Report_Iyman_Ahmed.docx
@@ -13,7 +13,7 @@
           <w:sz w:val="30"/>
           <w:szCs w:val="30"/>
         </w:rPr>
-        <w:t xml:space="preserve">Content Management in Healthcare:</w:t>
+        <w:t xml:space="preserve">Content Management in Health Care:</w:t>
       </w:r>
     </w:p>
     <w:p>
@@ -27,12 +27,12 @@
           <w:sz w:val="30"/>
           <w:szCs w:val="30"/>
         </w:rPr>
-        <w:t xml:space="preserve">Turning Written Policy into Answers a Payer Can Trust</w:t>
-      </w:r>
-    </w:p>
-    <w:p>
-      <w:pPr>
-        <w:spacing w:after="240"/>
+        <w:t xml:space="preserve">A Grounded Policy Assistant for Payment Integrity</w:t>
+      </w:r>
+    </w:p>
+    <w:p>
+      <w:pPr>
+        <w:spacing w:after="220"/>
       </w:pPr>
       <w:r>
         <w:rPr>
@@ -48,28 +48,20 @@
         <w:spacing w:after="140" w:line="276"/>
       </w:pPr>
       <w:r>
-        <w:t xml:space="preserve">Almost every decision in healthcare payment traces back to a written rule. Whether a service is covered, which code is correct, what a health plan agreed to pay, and how a clinical guideline defines medical necessity are all questions that documents answer. Those documents are long, they overlap, and they change on their own schedules. Content management in healthcare is the work of keeping this body of policy organized, current, and usable at the exact moment a person or a system needs an answer. For a payment integrity company like Cotiviti, that work sits close to the core of the business, because a wrong reading of a coverage rule is not a filing mistake. It is a claim paid that should have been denied, or a member and a provider treated unfairly.</w:t>
-      </w:r>
-    </w:p>
-    <w:p>
-      <w:pPr>
-        <w:spacing w:after="140" w:line="276"/>
-      </w:pPr>
-      <w:r>
-        <w:t xml:space="preserve">The hard part is not storing the documents. It is answering questions with them under time pressure. An analyst who wants to know whether a lumbar MRI is covered after two weeks of back pain has to find the right Local Coverage Determination, read past the parts that do not apply, and hold several rules in mind at once. Coverage policies, coding requirements, clinical guidelines, and payer provider contracts each carry their own language, and they rarely line up neatly. When a policy is revised, someone still has to notice what changed and decide which claims are affected. For a long time this has relied on search that matches keywords rather than meaning, so the burden of interpretation stays with the person. That is slow, it is uneven from one analyst to the next, and it does not scale as the rule library grows.</w:t>
+        <w:t xml:space="preserve">Content management in health care is the work of keeping billing and coding policies, clinical guidelines, and payer provider contracts organized, current, and usable at the moment a decision is made. For a payment integrity company like Cotiviti this sits close to the core of the business, because whether a claim should be paid depends on reading the right rule correctly. The documents are long, they change often, and today most of the interpretation still falls on a person searching by keyword, which is slow and uneven across analysts.</w:t>
       </w:r>
     </w:p>
     <w:p>
       <w:pPr>
         <w:pStyle w:val="Heading1"/>
-        <w:spacing w:after="110" w:before="220"/>
+        <w:spacing w:after="100" w:before="200"/>
       </w:pPr>
       <w:r>
         <w:rPr>
           <w:b/>
           <w:bCs/>
         </w:rPr>
-        <w:t xml:space="preserve">Where the technology is heading</w:t>
+        <w:t xml:space="preserve">Relevant trends</w:t>
       </w:r>
     </w:p>
     <w:p>
@@ -77,20 +69,20 @@
         <w:spacing w:after="140" w:line="276"/>
       </w:pPr>
       <w:r>
-        <w:t xml:space="preserve">The technology that touches this problem has moved quickly. Clinical language processing began with rules and pattern matching, and it now leans on large models that can read, summarize, and compare policy in plain language. The most important shift for a payer is retrieval augmented generation, which grounds a model's answer in retrieved source text and returns a citation next to it, so the answer can be checked instead of trusted blindly. Around that core, three capabilities are maturing at once. A model can summarize a dense policy into something an analyst reads in seconds. It can compare two versions of a rule and describe in plain words what tightened, loosened, or was newly added. And it is starting to convert written policy into structured rules and features that a downstream system can act on, which is the real bridge between a document and an automated payment edit.</w:t>
+        <w:t xml:space="preserve">The tools for this problem have shifted from keyword search to large language models that can read, summarize, and compare policy in plain language. The change that matters most for a payer is retrieval augmented generation, which grounds an answer in retrieved source text and returns a citation, so the answer can be verified rather than trusted. Alongside it, models can now summarize a dense policy in seconds, describe what changed between two versions of a rule, and begin turning written policy into structured rules that a downstream system can act on.</w:t>
       </w:r>
     </w:p>
     <w:p>
       <w:pPr>
         <w:pStyle w:val="Heading1"/>
-        <w:spacing w:after="110" w:before="220"/>
+        <w:spacing w:after="100" w:before="200"/>
       </w:pPr>
       <w:r>
         <w:rPr>
           <w:b/>
           <w:bCs/>
         </w:rPr>
-        <w:t xml:space="preserve">Opportunities and threats</w:t>
+        <w:t xml:space="preserve">What I built</w:t>
       </w:r>
     </w:p>
     <w:p>
@@ -98,20 +90,20 @@
         <w:spacing w:after="140" w:line="276"/>
       </w:pPr>
       <w:r>
-        <w:t xml:space="preserve">For Cotiviti the opportunity is direct. Grounded question answering turns minutes of policy research into seconds and attaches a source to every answer, which is exactly the evidence a payment integrity review needs. The same approach can read a claim against a coverage policy and lay out which requirements are met and which are not, which is close to how an analyst already adjudicates. Change detection can watch a living policy library and flag revisions before they lead to incorrect payments. The threats are just as concrete and deserve equal weight. A model that invents a code or a coverage rule is worse than no tool at all, because it produces a confident answer that happens to be wrong inside a workflow where compliance matters. Policy also goes stale, so answers have to track the current source of truth rather than an old snapshot. And automation without a human reviewer on payment decisions simply invites mistakes at scale. The lesson is that grounding, provenance, and a willingness to say nothing when the evidence is thin are not extras. They are the product.</w:t>
+        <w:t xml:space="preserve">To ground this in something real, I built Clinical Policy RAG, a small working prototype that applies these ideas to actual CMS material, including a Local Coverage Determination for lumbar MRI, ICD-10 coding guidance, and two years of a telehealth coverage policy. It does four things. It answers a policy question in plain English and cites the exact source document. It refuses to answer when the retrieved text does not support one, instead of inventing a code or a rule. It adjudicates a sample claim against a coverage determination and lists which requirements are met and which are not. And it compares two versions of a policy and reports what tightened, loosened, or was added.</w:t>
       </w:r>
     </w:p>
     <w:p>
       <w:pPr>
         <w:pStyle w:val="Heading1"/>
-        <w:spacing w:after="110" w:before="220"/>
+        <w:spacing w:after="100" w:before="200"/>
       </w:pPr>
       <w:r>
         <w:rPr>
           <w:b/>
           <w:bCs/>
         </w:rPr>
-        <w:t xml:space="preserve">A recommendation for Cotiviti</w:t>
+        <w:t xml:space="preserve">How it works</w:t>
       </w:r>
     </w:p>
     <w:p>
@@ -119,7 +111,20 @@
         <w:spacing w:after="140" w:line="276"/>
       </w:pPr>
       <w:r>
-        <w:t xml:space="preserve">My recommendation is to treat trust as the feature and to start narrow. Cotiviti should pilot a retrieval grounded, human in the loop policy assistant on one bounded coding domain, measure the two things that actually matter, which are the time an analyst takes to reach a cited answer and the accuracy of those citations, and only then widen the scope to change detection and to converting policy into machine readable rules. To make this concrete, I built a small working prototype for this assessment. It answers policy questions with citations, it refuses when the evidence is not present rather than guessing, and it adjudicates sample claims against a real coverage determination while showing the exact policy line it relied on. It runs entirely on a local model at no API cost, which keeps sensitive content on the machine. The prototype is deliberately simple, but it proves the first principle that should guide any larger effort. When an answer decides a payment, the system has to show its work, and it has to know when to stay quiet.</w:t>
+        <w:t xml:space="preserve">The system follows a straightforward retrieval augmented pipeline. A question is embedded with a small local model and used to search a vector database of policy text held in ChromaDB. The most relevant passages are retrieved, and because the policy files are compact the whole source document is pulled in, so rules that live in different sections are read together rather than in isolation. A local language model then answers using only that text and cites each source it relied on. Everything runs on the machine through LM Studio at no API cost, which keeps sensitive content in house. The rule throughout is that the model may only speak from retrieved policy, so every answer is traceable back to a document.</w:t>
+      </w:r>
+    </w:p>
+    <w:p>
+      <w:pPr>
+        <w:pStyle w:val="Heading1"/>
+        <w:spacing w:after="100" w:before="200"/>
+      </w:pPr>
+      <w:r>
+        <w:rPr>
+          <w:b/>
+          <w:bCs/>
+        </w:rPr>
+        <w:t xml:space="preserve">Opportunities and threats</w:t>
       </w:r>
     </w:p>
     <w:p>
@@ -127,7 +132,28 @@
         <w:spacing w:after="140" w:line="276"/>
       </w:pPr>
       <w:r>
-        <w:t xml:space="preserve">A pilot like this compounds over time. Once the assistant earns trust on a narrow domain, the same retrieval and grounding layer extends to the next set of policies without rebuilding anything, and the citations it produces become a signal for measuring where the model is still weak. The version tracking that powers change detection doubles as an audit trail, which is valuable on its own in a regulated setting. None of this needs a large model or a large budget to begin. What it needs is discipline about provenance and a clear line about where a person, and not a model, makes the final call. That is a position Cotiviti is unusually well placed to take, because the company already works at the meeting point of policy, claims, and the confidence that payers and providers place in an accurate result.</w:t>
+        <w:t xml:space="preserve">For Cotiviti the opportunity is direct. This turns minutes of policy research into seconds with a citation attached, and it mirrors claim adjudication by showing exactly which requirements a claim meets and which it misses. The same grounding supports monitoring a living rule library and flagging revisions before they cause incorrect payments. The threats are just as concrete. A model that fabricates a rule is a compliance liability rather than a help, policy goes stale if answers are not tied to the current source, and payment decisions should never be fully automated without a human reviewer. Grounding, provenance, and the ability to abstain are what make the approach safe to put in front of an analyst.</w:t>
+      </w:r>
+    </w:p>
+    <w:p>
+      <w:pPr>
+        <w:pStyle w:val="Heading1"/>
+        <w:spacing w:after="100" w:before="200"/>
+      </w:pPr>
+      <w:r>
+        <w:rPr>
+          <w:b/>
+          <w:bCs/>
+        </w:rPr>
+        <w:t xml:space="preserve">Recommendation for Cotiviti</w:t>
+      </w:r>
+    </w:p>
+    <w:p>
+      <w:pPr>
+        <w:spacing w:after="140" w:line="276"/>
+      </w:pPr>
+      <w:r>
+        <w:t xml:space="preserve">I recommend piloting a retrieval grounded, human in the loop policy assistant on one bounded coding domain, and measuring two things that matter, the time an analyst takes to reach a cited answer and the accuracy of those citations, before widening the scope to change detection and to converting policy into machine readable rules. The prototype shows this is achievable with small, local models and modest effort. The principle it proves is simple. When an answer decides a payment, the system has to show its work, and it has to know when to stay quiet.</w:t>
       </w:r>
     </w:p>
     <w:p>
@@ -166,7 +192,7 @@
       <w:r>
         <w:t xml:space="preserve">. Medicare Coverage Database. </w:t>
       </w:r>
-      <w:hyperlink w:history="1" r:id="rIdpfbvcv1av3oez4ka1tbds">
+      <w:hyperlink w:history="1" r:id="rId9vb1grumhxvbu5_kxemoe">
         <w:r>
           <w:rPr>
             <w:rStyle w:val="Hyperlink"/>
@@ -193,7 +219,7 @@
       <w:r>
         <w:t xml:space="preserve">. </w:t>
       </w:r>
-      <w:hyperlink w:history="1" r:id="rIdeif783c48wvyvibrs_mvh">
+      <w:hyperlink w:history="1" r:id="rIdtg4hsb1qz2yrhr6i_bp7l">
         <w:r>
           <w:rPr>
             <w:rStyle w:val="Hyperlink"/>
@@ -220,7 +246,7 @@
       <w:r>
         <w:t xml:space="preserve"> (MLN901705). </w:t>
       </w:r>
-      <w:hyperlink w:history="1" r:id="rIdevyo-m1vgowg8gmp1pnje">
+      <w:hyperlink w:history="1" r:id="rIdstohdk8ieso1ijr4kpeo3">
         <w:r>
           <w:rPr>
             <w:rStyle w:val="Hyperlink"/>
@@ -247,7 +273,7 @@
       <w:r>
         <w:t xml:space="preserve">. </w:t>
       </w:r>
-      <w:hyperlink w:history="1" r:id="rId2ju1cmfkre3sb--v6e3b0">
+      <w:hyperlink w:history="1" r:id="rIdwvwo7qajeajlgj1g1w3ht">
         <w:r>
           <w:rPr>
             <w:rStyle w:val="Hyperlink"/>
@@ -274,7 +300,7 @@
       <w:r>
         <w:t xml:space="preserve">. </w:t>
       </w:r>
-      <w:hyperlink w:history="1" r:id="rIdmx1uafeilena-d23sbra_">
+      <w:hyperlink w:history="1" r:id="rIdm4bfvusiky94luuow_eoi">
         <w:r>
           <w:rPr>
             <w:rStyle w:val="Hyperlink"/>
@@ -301,7 +327,7 @@
       <w:r>
         <w:t xml:space="preserve">. arXiv. </w:t>
       </w:r>
-      <w:hyperlink w:history="1" r:id="rIdk_kt2cv-gzs8q3kvzyj5z">
+      <w:hyperlink w:history="1" r:id="rIdh2pimxs77tdmp4ef0u3kt">
         <w:r>
           <w:rPr>
             <w:rStyle w:val="Hyperlink"/>
@@ -328,7 +354,7 @@
       <w:r>
         <w:t xml:space="preserve">(12), 1-38. </w:t>
       </w:r>
-      <w:hyperlink w:history="1" r:id="rIdvbtiakibarctpc-jnm2-f">
+      <w:hyperlink w:history="1" r:id="rIdx5felpxtbwasn-bh1iv25">
         <w:r>
           <w:rPr>
             <w:rStyle w:val="Hyperlink"/>
@@ -355,7 +381,7 @@
       <w:r>
         <w:t xml:space="preserve">. </w:t>
       </w:r>
-      <w:hyperlink w:history="1" r:id="rIdyqtsvhrgarj07990xec3p">
+      <w:hyperlink w:history="1" r:id="rIdlut7uijb3ehzuezjn2lac">
         <w:r>
           <w:rPr>
             <w:rStyle w:val="Hyperlink"/>
@@ -736,7 +762,7 @@
     <w:next w:val="Normal"/>
     <w:qFormat/>
     <w:pPr>
-      <w:spacing w:after="100" w:before="220"/>
+      <w:spacing w:after="100" w:before="200"/>
       <w:outlineLvl w:val="0"/>
     </w:pPr>
     <w:rPr>

</xml_diff>